<commit_message>
get up to date for final submission
omitting the changed csv file bc it's large and likely correct in the main branch
</commit_message>
<xml_diff>
--- a/hypothesis-testing.docx
+++ b/hypothesis-testing.docx
@@ -23,23 +23,62 @@
         <w:pStyle w:val="Date"/>
       </w:pPr>
       <w:r>
-        <w:t>2025-04-13</w:t>
+        <w:t>2025-04-20</w:t>
       </w:r>
     </w:p>
     <w:p>
       <w:pPr>
         <w:pStyle w:val="FirstParagraph"/>
       </w:pPr>
+      <w:r>
+        <w:t>Read the hospital data</w:t>
+      </w:r>
     </w:p>
     <w:p>
       <w:pPr>
-        <w:pStyle w:val="FirstParagraph"/>
-      </w:pPr>
-      <w:r>
-        <w:t>Read the hospital data</w:t>
-      </w:r>
-      <w:r>
-        <w:t>:</w:t>
+        <w:pStyle w:val="SourceCode"/>
+      </w:pPr>
+      <w:r>
+        <w:rPr>
+          <w:rStyle w:val="NormalTok"/>
+        </w:rPr>
+        <w:t xml:space="preserve">hospital_data </w:t>
+      </w:r>
+      <w:r>
+        <w:rPr>
+          <w:rStyle w:val="OtherTok"/>
+        </w:rPr>
+        <w:t>&lt;-</w:t>
+      </w:r>
+      <w:r>
+        <w:rPr>
+          <w:rStyle w:val="NormalTok"/>
+        </w:rPr>
+        <w:t xml:space="preserve"> </w:t>
+      </w:r>
+      <w:r>
+        <w:rPr>
+          <w:rStyle w:val="FunctionTok"/>
+        </w:rPr>
+        <w:t>read_csv</w:t>
+      </w:r>
+      <w:r>
+        <w:rPr>
+          <w:rStyle w:val="NormalTok"/>
+        </w:rPr>
+        <w:t>(</w:t>
+      </w:r>
+      <w:r>
+        <w:rPr>
+          <w:rStyle w:val="StringTok"/>
+        </w:rPr>
+        <w:t>"data/Hospitals_gdb_771050112109123987.csv"</w:t>
+      </w:r>
+      <w:r>
+        <w:rPr>
+          <w:rStyle w:val="NormalTok"/>
+        </w:rPr>
+        <w:t>)</w:t>
       </w:r>
     </w:p>
     <w:p>
@@ -48,103 +87,127 @@
       </w:pPr>
       <w:r>
         <w:rPr>
-          <w:rStyle w:val="NormalTok"/>
-        </w:rPr>
-        <w:t xml:space="preserve">hospital_data </w:t>
-      </w:r>
-      <w:r>
-        <w:rPr>
-          <w:rStyle w:val="OtherTok"/>
-        </w:rPr>
-        <w:t>&lt;-</w:t>
-      </w:r>
-      <w:r>
-        <w:rPr>
-          <w:rStyle w:val="NormalTok"/>
-        </w:rPr>
-        <w:t xml:space="preserve"> </w:t>
-      </w:r>
-      <w:r>
-        <w:rPr>
-          <w:rStyle w:val="FunctionTok"/>
-        </w:rPr>
-        <w:t>read_csv</w:t>
-      </w:r>
-      <w:r>
-        <w:rPr>
-          <w:rStyle w:val="NormalTok"/>
-        </w:rPr>
-        <w:t>(</w:t>
-      </w:r>
-      <w:r>
-        <w:rPr>
-          <w:rStyle w:val="StringTok"/>
-        </w:rPr>
-        <w:t>"data/Hospitals_gdb_771050112109123987.csv"</w:t>
-      </w:r>
-      <w:r>
-        <w:rPr>
-          <w:rStyle w:val="NormalTok"/>
-        </w:rPr>
-        <w:t>)</w:t>
+          <w:rStyle w:val="VerbatimChar"/>
+        </w:rPr>
+        <w:t>## Rows: 8340 Columns: 34</w:t>
+      </w:r>
+      <w:r>
+        <w:br/>
+      </w:r>
+      <w:r>
+        <w:rPr>
+          <w:rStyle w:val="VerbatimChar"/>
+        </w:rPr>
+        <w:t>## ── Column specification ────────────────────────────────────────────────────────</w:t>
+      </w:r>
+      <w:r>
+        <w:br/>
+      </w:r>
+      <w:r>
+        <w:rPr>
+          <w:rStyle w:val="VerbatimChar"/>
+        </w:rPr>
+        <w:t>## Delimiter: ","</w:t>
+      </w:r>
+      <w:r>
+        <w:br/>
+      </w:r>
+      <w:r>
+        <w:rPr>
+          <w:rStyle w:val="VerbatimChar"/>
+        </w:rPr>
+        <w:t>## chr (25): ID, NAME, ADDRESS, CITY, STATE, ZIP, ZIP4, TELEPHONE, TYPE, STATUS...</w:t>
+      </w:r>
+      <w:r>
+        <w:br/>
+      </w:r>
+      <w:r>
+        <w:rPr>
+          <w:rStyle w:val="VerbatimChar"/>
+        </w:rPr>
+        <w:t>## dbl  (9): OBJECTID, POPULATION, LATITUDE, LONGITUDE, NAICS_CODE, TTL_STAFF, ...</w:t>
+      </w:r>
+      <w:r>
+        <w:br/>
+      </w:r>
+      <w:r>
+        <w:rPr>
+          <w:rStyle w:val="VerbatimChar"/>
+        </w:rPr>
+        <w:t xml:space="preserve">## </w:t>
+      </w:r>
+      <w:r>
+        <w:br/>
+      </w:r>
+      <w:r>
+        <w:rPr>
+          <w:rStyle w:val="VerbatimChar"/>
+        </w:rPr>
+        <w:t>## ℹ Use `spec()` to retrieve the full column specification for this data.</w:t>
+      </w:r>
+      <w:r>
+        <w:br/>
+      </w:r>
+      <w:r>
+        <w:rPr>
+          <w:rStyle w:val="VerbatimChar"/>
+        </w:rPr>
+        <w:t>## ℹ Specify the column types or set `show_col_types = FALSE` to quiet this message.</w:t>
       </w:r>
     </w:p>
     <w:p>
       <w:pPr>
-        <w:pStyle w:val="SourceCode"/>
-      </w:pPr>
-      <w:r>
-        <w:rPr>
-          <w:rStyle w:val="VerbatimChar"/>
-        </w:rPr>
-        <w:t>## Rows: 8340 Columns: 34</w:t>
-      </w:r>
-      <w:r>
-        <w:br/>
-      </w:r>
-      <w:r>
-        <w:rPr>
-          <w:rStyle w:val="VerbatimChar"/>
-        </w:rPr>
-        <w:t>## ── Column specification ────────────────────────────────────────────────────────</w:t>
-      </w:r>
-      <w:r>
-        <w:br/>
-      </w:r>
-      <w:r>
-        <w:rPr>
-          <w:rStyle w:val="VerbatimChar"/>
-        </w:rPr>
-        <w:t>## Delimiter: ","</w:t>
-      </w:r>
-      <w:r>
-        <w:br/>
-      </w:r>
-      <w:r>
-        <w:rPr>
-          <w:rStyle w:val="VerbatimChar"/>
-        </w:rPr>
-        <w:t>## chr (25): ID, NAME, ADDRESS, CITY, STATE, ZIP, ZIP4, TELEPHONE, TYPE, STATUS...</w:t>
-      </w:r>
-      <w:r>
-        <w:br/>
-      </w:r>
-      <w:r>
-        <w:rPr>
-          <w:rStyle w:val="VerbatimChar"/>
-        </w:rPr>
-        <w:t>## dbl  (9): OBJECTID, POPULATION, LATITUDE, LONGITUDE, NAICS_CODE, TTL_STAFF, ...</w:t>
+        <w:pStyle w:val="FirstParagraph"/>
+      </w:pPr>
+      <w:r>
+        <w:t>Read the COVID-19 data</w:t>
       </w:r>
     </w:p>
     <w:p>
       <w:pPr>
-        <w:pStyle w:val="FirstParagraph"/>
-      </w:pPr>
-      <w:r>
-        <w:t>Read the COVID-19 data</w:t>
-      </w:r>
-      <w:r>
-        <w:t>:</w:t>
+        <w:pStyle w:val="SourceCode"/>
+      </w:pPr>
+      <w:r>
+        <w:rPr>
+          <w:rStyle w:val="NormalTok"/>
+        </w:rPr>
+        <w:t xml:space="preserve">covid_data </w:t>
+      </w:r>
+      <w:r>
+        <w:rPr>
+          <w:rStyle w:val="OtherTok"/>
+        </w:rPr>
+        <w:t>&lt;-</w:t>
+      </w:r>
+      <w:r>
+        <w:rPr>
+          <w:rStyle w:val="NormalTok"/>
+        </w:rPr>
+        <w:t xml:space="preserve"> </w:t>
+      </w:r>
+      <w:r>
+        <w:rPr>
+          <w:rStyle w:val="FunctionTok"/>
+        </w:rPr>
+        <w:t>read_csv</w:t>
+      </w:r>
+      <w:r>
+        <w:rPr>
+          <w:rStyle w:val="NormalTok"/>
+        </w:rPr>
+        <w:t>(</w:t>
+      </w:r>
+      <w:r>
+        <w:rPr>
+          <w:rStyle w:val="StringTok"/>
+        </w:rPr>
+        <w:t>"data/total_cases_by_county.csv"</w:t>
+      </w:r>
+      <w:r>
+        <w:rPr>
+          <w:rStyle w:val="NormalTok"/>
+        </w:rPr>
+        <w:t>)</w:t>
       </w:r>
     </w:p>
     <w:p>
@@ -153,417 +216,910 @@
       </w:pPr>
       <w:r>
         <w:rPr>
-          <w:rStyle w:val="NormalTok"/>
-        </w:rPr>
-        <w:t xml:space="preserve">covid_data </w:t>
-      </w:r>
-      <w:r>
-        <w:rPr>
-          <w:rStyle w:val="OtherTok"/>
-        </w:rPr>
-        <w:t>&lt;-</w:t>
-      </w:r>
-      <w:r>
-        <w:rPr>
-          <w:rStyle w:val="NormalTok"/>
-        </w:rPr>
-        <w:t xml:space="preserve"> </w:t>
-      </w:r>
-      <w:r>
-        <w:rPr>
-          <w:rStyle w:val="FunctionTok"/>
-        </w:rPr>
-        <w:t>read_csv</w:t>
-      </w:r>
-      <w:r>
-        <w:rPr>
-          <w:rStyle w:val="NormalTok"/>
-        </w:rPr>
-        <w:t>(</w:t>
-      </w:r>
-      <w:r>
-        <w:rPr>
-          <w:rStyle w:val="StringTok"/>
-        </w:rPr>
-        <w:t>"data/total_cases_by_county.csv"</w:t>
-      </w:r>
-      <w:r>
-        <w:rPr>
-          <w:rStyle w:val="NormalTok"/>
-        </w:rPr>
-        <w:t>)</w:t>
+          <w:rStyle w:val="VerbatimChar"/>
+        </w:rPr>
+        <w:t>## Rows: 3217 Columns: 6</w:t>
+      </w:r>
+      <w:r>
+        <w:br/>
+      </w:r>
+      <w:r>
+        <w:rPr>
+          <w:rStyle w:val="VerbatimChar"/>
+        </w:rPr>
+        <w:t>## ── Column specification ────────────────────────────────────────────────────────</w:t>
+      </w:r>
+      <w:r>
+        <w:br/>
+      </w:r>
+      <w:r>
+        <w:rPr>
+          <w:rStyle w:val="VerbatimChar"/>
+        </w:rPr>
+        <w:t>## Delimiter: ","</w:t>
+      </w:r>
+      <w:r>
+        <w:br/>
+      </w:r>
+      <w:r>
+        <w:rPr>
+          <w:rStyle w:val="VerbatimChar"/>
+        </w:rPr>
+        <w:t>## chr  (2): state, county</w:t>
+      </w:r>
+      <w:r>
+        <w:br/>
+      </w:r>
+      <w:r>
+        <w:rPr>
+          <w:rStyle w:val="VerbatimChar"/>
+        </w:rPr>
+        <w:t>## dbl  (3): COUNTYFIPS, total_cases, deaths</w:t>
+      </w:r>
+      <w:r>
+        <w:br/>
+      </w:r>
+      <w:r>
+        <w:rPr>
+          <w:rStyle w:val="VerbatimChar"/>
+        </w:rPr>
+        <w:t>## date (1): date</w:t>
+      </w:r>
+      <w:r>
+        <w:br/>
+      </w:r>
+      <w:r>
+        <w:rPr>
+          <w:rStyle w:val="VerbatimChar"/>
+        </w:rPr>
+        <w:t xml:space="preserve">## </w:t>
+      </w:r>
+      <w:r>
+        <w:br/>
+      </w:r>
+      <w:r>
+        <w:rPr>
+          <w:rStyle w:val="VerbatimChar"/>
+        </w:rPr>
+        <w:t>## ℹ Use `spec()` to retrieve the full column specification for this data.</w:t>
+      </w:r>
+      <w:r>
+        <w:br/>
+      </w:r>
+      <w:r>
+        <w:rPr>
+          <w:rStyle w:val="VerbatimChar"/>
+        </w:rPr>
+        <w:t>## ℹ Specify the column types or set `show_col_types = FALSE` to quiet this message.</w:t>
       </w:r>
     </w:p>
     <w:p>
       <w:pPr>
-        <w:pStyle w:val="SourceCode"/>
-      </w:pPr>
-      <w:r>
-        <w:rPr>
-          <w:rStyle w:val="VerbatimChar"/>
-        </w:rPr>
-        <w:t>## Rows: 3217 Columns: 4</w:t>
-      </w:r>
-      <w:r>
-        <w:br/>
-      </w:r>
-      <w:r>
-        <w:rPr>
-          <w:rStyle w:val="VerbatimChar"/>
-        </w:rPr>
-        <w:t>## ── Column specification ────────────────────────────────────────────────────────</w:t>
-      </w:r>
-      <w:r>
-        <w:br/>
-      </w:r>
-      <w:r>
-        <w:rPr>
-          <w:rStyle w:val="VerbatimChar"/>
-        </w:rPr>
-        <w:t>## Delimiter: ","</w:t>
-      </w:r>
-      <w:r>
-        <w:br/>
-      </w:r>
-      <w:r>
-        <w:rPr>
-          <w:rStyle w:val="VerbatimChar"/>
-        </w:rPr>
-        <w:t>## chr (2): state, COUNTY</w:t>
-      </w:r>
-      <w:r>
-        <w:br/>
-      </w:r>
-      <w:r>
-        <w:rPr>
-          <w:rStyle w:val="VerbatimChar"/>
-        </w:rPr>
-        <w:t>## dbl (2): COUNTYFIPS, total_cases</w:t>
+        <w:pStyle w:val="FirstParagraph"/>
+      </w:pPr>
+      <w:r>
+        <w:t>Preprocess hospital data and hospital data, ensuring the join column is the same data type</w:t>
       </w:r>
     </w:p>
     <w:p>
       <w:pPr>
-        <w:pStyle w:val="FirstParagraph"/>
-      </w:pPr>
-      <w:r>
-        <w:t>Preprocess hospital data and hospital data, ensuring the join column is the same data type</w:t>
-      </w:r>
-      <w:r>
-        <w:t>:</w:t>
+        <w:pStyle w:val="SourceCode"/>
+      </w:pPr>
+      <w:r>
+        <w:rPr>
+          <w:rStyle w:val="NormalTok"/>
+        </w:rPr>
+        <w:t xml:space="preserve">hospital_density </w:t>
+      </w:r>
+      <w:r>
+        <w:rPr>
+          <w:rStyle w:val="OtherTok"/>
+        </w:rPr>
+        <w:t>&lt;-</w:t>
+      </w:r>
+      <w:r>
+        <w:rPr>
+          <w:rStyle w:val="NormalTok"/>
+        </w:rPr>
+        <w:t xml:space="preserve"> hospital_data </w:t>
+      </w:r>
+      <w:r>
+        <w:rPr>
+          <w:rStyle w:val="SpecialCharTok"/>
+        </w:rPr>
+        <w:t>%&gt;%</w:t>
+      </w:r>
+      <w:r>
+        <w:br/>
+      </w:r>
+      <w:r>
+        <w:rPr>
+          <w:rStyle w:val="NormalTok"/>
+        </w:rPr>
+        <w:t xml:space="preserve">  </w:t>
+      </w:r>
+      <w:r>
+        <w:rPr>
+          <w:rStyle w:val="FunctionTok"/>
+        </w:rPr>
+        <w:t>count</w:t>
+      </w:r>
+      <w:r>
+        <w:rPr>
+          <w:rStyle w:val="NormalTok"/>
+        </w:rPr>
+        <w:t xml:space="preserve">(COUNTYFIPS, </w:t>
+      </w:r>
+      <w:r>
+        <w:rPr>
+          <w:rStyle w:val="AttributeTok"/>
+        </w:rPr>
+        <w:t>name =</w:t>
+      </w:r>
+      <w:r>
+        <w:rPr>
+          <w:rStyle w:val="NormalTok"/>
+        </w:rPr>
+        <w:t xml:space="preserve"> </w:t>
+      </w:r>
+      <w:r>
+        <w:rPr>
+          <w:rStyle w:val="StringTok"/>
+        </w:rPr>
+        <w:t>"hospital_count"</w:t>
+      </w:r>
+      <w:r>
+        <w:rPr>
+          <w:rStyle w:val="NormalTok"/>
+        </w:rPr>
+        <w:t>)</w:t>
+      </w:r>
+      <w:r>
+        <w:br/>
+      </w:r>
+      <w:r>
+        <w:br/>
+      </w:r>
+      <w:r>
+        <w:rPr>
+          <w:rStyle w:val="NormalTok"/>
+        </w:rPr>
+        <w:t xml:space="preserve">covid_data </w:t>
+      </w:r>
+      <w:r>
+        <w:rPr>
+          <w:rStyle w:val="OtherTok"/>
+        </w:rPr>
+        <w:t>&lt;-</w:t>
+      </w:r>
+      <w:r>
+        <w:rPr>
+          <w:rStyle w:val="NormalTok"/>
+        </w:rPr>
+        <w:t xml:space="preserve"> covid_data </w:t>
+      </w:r>
+      <w:r>
+        <w:rPr>
+          <w:rStyle w:val="SpecialCharTok"/>
+        </w:rPr>
+        <w:t>%&gt;%</w:t>
+      </w:r>
+      <w:r>
+        <w:br/>
+      </w:r>
+      <w:r>
+        <w:rPr>
+          <w:rStyle w:val="NormalTok"/>
+        </w:rPr>
+        <w:t xml:space="preserve">  </w:t>
+      </w:r>
+      <w:r>
+        <w:rPr>
+          <w:rStyle w:val="FunctionTok"/>
+        </w:rPr>
+        <w:t>mutate</w:t>
+      </w:r>
+      <w:r>
+        <w:rPr>
+          <w:rStyle w:val="NormalTok"/>
+        </w:rPr>
+        <w:t>(</w:t>
+      </w:r>
+      <w:r>
+        <w:rPr>
+          <w:rStyle w:val="AttributeTok"/>
+        </w:rPr>
+        <w:t>COUNTYFIPS =</w:t>
+      </w:r>
+      <w:r>
+        <w:rPr>
+          <w:rStyle w:val="NormalTok"/>
+        </w:rPr>
+        <w:t xml:space="preserve"> </w:t>
+      </w:r>
+      <w:r>
+        <w:rPr>
+          <w:rStyle w:val="FunctionTok"/>
+        </w:rPr>
+        <w:t>as.character</w:t>
+      </w:r>
+      <w:r>
+        <w:rPr>
+          <w:rStyle w:val="NormalTok"/>
+        </w:rPr>
+        <w:t>(COUNTYFIPS))</w:t>
+      </w:r>
+      <w:r>
+        <w:br/>
+      </w:r>
+      <w:r>
+        <w:br/>
+      </w:r>
+      <w:r>
+        <w:rPr>
+          <w:rStyle w:val="NormalTok"/>
+        </w:rPr>
+        <w:t xml:space="preserve">hospital_density </w:t>
+      </w:r>
+      <w:r>
+        <w:rPr>
+          <w:rStyle w:val="OtherTok"/>
+        </w:rPr>
+        <w:t>&lt;-</w:t>
+      </w:r>
+      <w:r>
+        <w:rPr>
+          <w:rStyle w:val="NormalTok"/>
+        </w:rPr>
+        <w:t xml:space="preserve"> hospital_density </w:t>
+      </w:r>
+      <w:r>
+        <w:rPr>
+          <w:rStyle w:val="SpecialCharTok"/>
+        </w:rPr>
+        <w:t>%&gt;%</w:t>
+      </w:r>
+      <w:r>
+        <w:br/>
+      </w:r>
+      <w:r>
+        <w:rPr>
+          <w:rStyle w:val="NormalTok"/>
+        </w:rPr>
+        <w:t xml:space="preserve">  </w:t>
+      </w:r>
+      <w:r>
+        <w:rPr>
+          <w:rStyle w:val="FunctionTok"/>
+        </w:rPr>
+        <w:t>mutate</w:t>
+      </w:r>
+      <w:r>
+        <w:rPr>
+          <w:rStyle w:val="NormalTok"/>
+        </w:rPr>
+        <w:t>(</w:t>
+      </w:r>
+      <w:r>
+        <w:rPr>
+          <w:rStyle w:val="AttributeTok"/>
+        </w:rPr>
+        <w:t>COUNTYFIPS =</w:t>
+      </w:r>
+      <w:r>
+        <w:rPr>
+          <w:rStyle w:val="NormalTok"/>
+        </w:rPr>
+        <w:t xml:space="preserve"> </w:t>
+      </w:r>
+      <w:r>
+        <w:rPr>
+          <w:rStyle w:val="FunctionTok"/>
+        </w:rPr>
+        <w:t>as.character</w:t>
+      </w:r>
+      <w:r>
+        <w:rPr>
+          <w:rStyle w:val="NormalTok"/>
+        </w:rPr>
+        <w:t>(COUNTYFIPS))</w:t>
       </w:r>
     </w:p>
     <w:p>
       <w:pPr>
-        <w:pStyle w:val="SourceCode"/>
-      </w:pPr>
-      <w:r>
-        <w:rPr>
-          <w:rStyle w:val="NormalTok"/>
-        </w:rPr>
-        <w:t xml:space="preserve">hospital_density </w:t>
-      </w:r>
-      <w:r>
-        <w:rPr>
-          <w:rStyle w:val="OtherTok"/>
-        </w:rPr>
-        <w:t>&lt;-</w:t>
-      </w:r>
-      <w:r>
-        <w:rPr>
-          <w:rStyle w:val="NormalTok"/>
-        </w:rPr>
-        <w:t xml:space="preserve"> hospital_data </w:t>
-      </w:r>
-      <w:r>
-        <w:rPr>
-          <w:rStyle w:val="SpecialCharTok"/>
-        </w:rPr>
-        <w:t>%&gt;%</w:t>
-      </w:r>
-      <w:r>
-        <w:br/>
-      </w:r>
-      <w:r>
-        <w:rPr>
-          <w:rStyle w:val="NormalTok"/>
-        </w:rPr>
-        <w:t xml:space="preserve">  </w:t>
-      </w:r>
-      <w:r>
-        <w:rPr>
-          <w:rStyle w:val="FunctionTok"/>
-        </w:rPr>
-        <w:t>count</w:t>
-      </w:r>
-      <w:r>
-        <w:rPr>
-          <w:rStyle w:val="NormalTok"/>
-        </w:rPr>
-        <w:t xml:space="preserve">(COUNTYFIPS, </w:t>
-      </w:r>
-      <w:r>
-        <w:rPr>
-          <w:rStyle w:val="AttributeTok"/>
-        </w:rPr>
-        <w:t>name =</w:t>
-      </w:r>
-      <w:r>
-        <w:rPr>
-          <w:rStyle w:val="NormalTok"/>
-        </w:rPr>
-        <w:t xml:space="preserve"> </w:t>
-      </w:r>
-      <w:r>
-        <w:rPr>
-          <w:rStyle w:val="StringTok"/>
-        </w:rPr>
-        <w:t>"hospital_count"</w:t>
-      </w:r>
-      <w:r>
-        <w:rPr>
-          <w:rStyle w:val="NormalTok"/>
-        </w:rPr>
-        <w:t>)</w:t>
-      </w:r>
-      <w:r>
-        <w:br/>
-      </w:r>
-      <w:r>
-        <w:br/>
-      </w:r>
-      <w:r>
-        <w:rPr>
-          <w:rStyle w:val="NormalTok"/>
-        </w:rPr>
-        <w:t xml:space="preserve">covid_data </w:t>
-      </w:r>
-      <w:r>
-        <w:rPr>
-          <w:rStyle w:val="OtherTok"/>
-        </w:rPr>
-        <w:t>&lt;-</w:t>
-      </w:r>
-      <w:r>
-        <w:rPr>
-          <w:rStyle w:val="NormalTok"/>
-        </w:rPr>
-        <w:t xml:space="preserve"> covid_data </w:t>
-      </w:r>
-      <w:r>
-        <w:rPr>
-          <w:rStyle w:val="SpecialCharTok"/>
-        </w:rPr>
-        <w:t>%&gt;%</w:t>
-      </w:r>
-      <w:r>
-        <w:br/>
-      </w:r>
-      <w:r>
-        <w:rPr>
-          <w:rStyle w:val="NormalTok"/>
-        </w:rPr>
-        <w:t xml:space="preserve">  </w:t>
-      </w:r>
-      <w:r>
-        <w:rPr>
-          <w:rStyle w:val="FunctionTok"/>
-        </w:rPr>
-        <w:t>mutate</w:t>
-      </w:r>
-      <w:r>
-        <w:rPr>
-          <w:rStyle w:val="NormalTok"/>
-        </w:rPr>
-        <w:t>(</w:t>
-      </w:r>
-      <w:r>
-        <w:rPr>
-          <w:rStyle w:val="AttributeTok"/>
-        </w:rPr>
-        <w:t>COUNTYFIPS =</w:t>
-      </w:r>
-      <w:r>
-        <w:rPr>
-          <w:rStyle w:val="NormalTok"/>
-        </w:rPr>
-        <w:t xml:space="preserve"> </w:t>
-      </w:r>
-      <w:r>
-        <w:rPr>
-          <w:rStyle w:val="FunctionTok"/>
-        </w:rPr>
-        <w:t>as.character</w:t>
-      </w:r>
-      <w:r>
-        <w:rPr>
-          <w:rStyle w:val="NormalTok"/>
-        </w:rPr>
-        <w:t>(COUNTYFIPS))</w:t>
-      </w:r>
-      <w:r>
-        <w:br/>
-      </w:r>
-      <w:r>
-        <w:br/>
-      </w:r>
-      <w:r>
-        <w:rPr>
-          <w:rStyle w:val="NormalTok"/>
-        </w:rPr>
-        <w:t xml:space="preserve">hospital_density </w:t>
-      </w:r>
-      <w:r>
-        <w:rPr>
-          <w:rStyle w:val="OtherTok"/>
-        </w:rPr>
-        <w:t>&lt;-</w:t>
-      </w:r>
-      <w:r>
-        <w:rPr>
-          <w:rStyle w:val="NormalTok"/>
-        </w:rPr>
-        <w:t xml:space="preserve"> hospital_density </w:t>
-      </w:r>
-      <w:r>
-        <w:rPr>
-          <w:rStyle w:val="SpecialCharTok"/>
-        </w:rPr>
-        <w:t>%&gt;%</w:t>
-      </w:r>
-      <w:r>
-        <w:br/>
-      </w:r>
-      <w:r>
-        <w:rPr>
-          <w:rStyle w:val="NormalTok"/>
-        </w:rPr>
-        <w:t xml:space="preserve">  </w:t>
-      </w:r>
-      <w:r>
-        <w:rPr>
-          <w:rStyle w:val="FunctionTok"/>
-        </w:rPr>
-        <w:t>mutate</w:t>
-      </w:r>
-      <w:r>
-        <w:rPr>
-          <w:rStyle w:val="NormalTok"/>
-        </w:rPr>
-        <w:t>(</w:t>
-      </w:r>
-      <w:r>
-        <w:rPr>
-          <w:rStyle w:val="AttributeTok"/>
-        </w:rPr>
-        <w:t>COUNTYFIPS =</w:t>
-      </w:r>
-      <w:r>
-        <w:rPr>
-          <w:rStyle w:val="NormalTok"/>
-        </w:rPr>
-        <w:t xml:space="preserve"> </w:t>
-      </w:r>
-      <w:r>
-        <w:rPr>
-          <w:rStyle w:val="FunctionTok"/>
-        </w:rPr>
-        <w:t>as.character</w:t>
-      </w:r>
-      <w:r>
-        <w:rPr>
-          <w:rStyle w:val="NormalTok"/>
-        </w:rPr>
-        <w:t>(COUNTYFIPS))</w:t>
+        <w:pStyle w:val="FirstParagraph"/>
+      </w:pPr>
+      <w:r>
+        <w:lastRenderedPageBreak/>
+        <w:t>Join by county (using FIPS code)</w:t>
       </w:r>
     </w:p>
     <w:p>
       <w:pPr>
-        <w:pStyle w:val="FirstParagraph"/>
-      </w:pPr>
-      <w:r>
-        <w:t>Join by county (using FIPS code)</w:t>
+        <w:pStyle w:val="SourceCode"/>
+      </w:pPr>
+      <w:proofErr w:type="spellStart"/>
+      <w:r>
+        <w:rPr>
+          <w:rStyle w:val="NormalTok"/>
+        </w:rPr>
+        <w:t>hospital_density</w:t>
+      </w:r>
+      <w:proofErr w:type="spellEnd"/>
+      <w:r>
+        <w:rPr>
+          <w:rStyle w:val="NormalTok"/>
+        </w:rPr>
+        <w:t xml:space="preserve"> </w:t>
+      </w:r>
+      <w:r>
+        <w:rPr>
+          <w:rStyle w:val="OtherTok"/>
+        </w:rPr>
+        <w:t>&lt;-</w:t>
+      </w:r>
+      <w:r>
+        <w:rPr>
+          <w:rStyle w:val="NormalTok"/>
+        </w:rPr>
+        <w:t xml:space="preserve"> </w:t>
+      </w:r>
+      <w:proofErr w:type="spellStart"/>
+      <w:r>
+        <w:rPr>
+          <w:rStyle w:val="NormalTok"/>
+        </w:rPr>
+        <w:t>hospital_data</w:t>
+      </w:r>
+      <w:proofErr w:type="spellEnd"/>
+      <w:r>
+        <w:rPr>
+          <w:rStyle w:val="NormalTok"/>
+        </w:rPr>
+        <w:t xml:space="preserve"> </w:t>
+      </w:r>
+      <w:r>
+        <w:rPr>
+          <w:rStyle w:val="SpecialCharTok"/>
+        </w:rPr>
+        <w:t>%&gt;%</w:t>
+      </w:r>
+      <w:r>
+        <w:br/>
+      </w:r>
+      <w:r>
+        <w:rPr>
+          <w:rStyle w:val="NormalTok"/>
+        </w:rPr>
+        <w:t xml:space="preserve">  </w:t>
+      </w:r>
+      <w:r>
+        <w:rPr>
+          <w:rStyle w:val="FunctionTok"/>
+        </w:rPr>
+        <w:t>count</w:t>
+      </w:r>
+      <w:r>
+        <w:rPr>
+          <w:rStyle w:val="NormalTok"/>
+        </w:rPr>
+        <w:t xml:space="preserve">(COUNTYFIPS, </w:t>
+      </w:r>
+      <w:r>
+        <w:rPr>
+          <w:rStyle w:val="AttributeTok"/>
+        </w:rPr>
+        <w:t>name =</w:t>
+      </w:r>
+      <w:r>
+        <w:rPr>
+          <w:rStyle w:val="NormalTok"/>
+        </w:rPr>
+        <w:t xml:space="preserve"> </w:t>
+      </w:r>
+      <w:r>
+        <w:rPr>
+          <w:rStyle w:val="StringTok"/>
+        </w:rPr>
+        <w:t>"</w:t>
+      </w:r>
+      <w:proofErr w:type="spellStart"/>
+      <w:r>
+        <w:rPr>
+          <w:rStyle w:val="StringTok"/>
+        </w:rPr>
+        <w:t>hospital_count</w:t>
+      </w:r>
+      <w:proofErr w:type="spellEnd"/>
+      <w:r>
+        <w:rPr>
+          <w:rStyle w:val="StringTok"/>
+        </w:rPr>
+        <w:t>"</w:t>
+      </w:r>
+      <w:r>
+        <w:rPr>
+          <w:rStyle w:val="NormalTok"/>
+        </w:rPr>
+        <w:t>)</w:t>
+      </w:r>
+      <w:r>
+        <w:br/>
+      </w:r>
+      <w:r>
+        <w:br/>
+      </w:r>
+      <w:proofErr w:type="spellStart"/>
+      <w:r>
+        <w:rPr>
+          <w:rStyle w:val="NormalTok"/>
+        </w:rPr>
+        <w:t>covid_data</w:t>
+      </w:r>
+      <w:proofErr w:type="spellEnd"/>
+      <w:r>
+        <w:rPr>
+          <w:rStyle w:val="NormalTok"/>
+        </w:rPr>
+        <w:t xml:space="preserve"> </w:t>
+      </w:r>
+      <w:r>
+        <w:rPr>
+          <w:rStyle w:val="OtherTok"/>
+        </w:rPr>
+        <w:t>&lt;-</w:t>
+      </w:r>
+      <w:r>
+        <w:rPr>
+          <w:rStyle w:val="NormalTok"/>
+        </w:rPr>
+        <w:t xml:space="preserve"> </w:t>
+      </w:r>
+      <w:proofErr w:type="spellStart"/>
+      <w:r>
+        <w:rPr>
+          <w:rStyle w:val="NormalTok"/>
+        </w:rPr>
+        <w:t>covid_data</w:t>
+      </w:r>
+      <w:proofErr w:type="spellEnd"/>
+      <w:r>
+        <w:rPr>
+          <w:rStyle w:val="NormalTok"/>
+        </w:rPr>
+        <w:t xml:space="preserve"> </w:t>
+      </w:r>
+      <w:r>
+        <w:rPr>
+          <w:rStyle w:val="SpecialCharTok"/>
+        </w:rPr>
+        <w:t>%&gt;%</w:t>
+      </w:r>
+      <w:r>
+        <w:br/>
+      </w:r>
+      <w:r>
+        <w:rPr>
+          <w:rStyle w:val="NormalTok"/>
+        </w:rPr>
+        <w:t xml:space="preserve">  </w:t>
+      </w:r>
+      <w:r>
+        <w:rPr>
+          <w:rStyle w:val="FunctionTok"/>
+        </w:rPr>
+        <w:t>mutate</w:t>
+      </w:r>
+      <w:r>
+        <w:rPr>
+          <w:rStyle w:val="NormalTok"/>
+        </w:rPr>
+        <w:t>(</w:t>
+      </w:r>
+      <w:r>
+        <w:rPr>
+          <w:rStyle w:val="AttributeTok"/>
+        </w:rPr>
+        <w:t>COUNTYFIPS =</w:t>
+      </w:r>
+      <w:r>
+        <w:rPr>
+          <w:rStyle w:val="NormalTok"/>
+        </w:rPr>
+        <w:t xml:space="preserve"> </w:t>
+      </w:r>
+      <w:proofErr w:type="spellStart"/>
+      <w:r>
+        <w:rPr>
+          <w:rStyle w:val="FunctionTok"/>
+        </w:rPr>
+        <w:t>as.character</w:t>
+      </w:r>
+      <w:proofErr w:type="spellEnd"/>
+      <w:r>
+        <w:rPr>
+          <w:rStyle w:val="NormalTok"/>
+        </w:rPr>
+        <w:t>(COUNTYFIPS))</w:t>
+      </w:r>
+      <w:r>
+        <w:br/>
+      </w:r>
+      <w:r>
+        <w:br/>
+      </w:r>
+      <w:proofErr w:type="spellStart"/>
+      <w:r>
+        <w:rPr>
+          <w:rStyle w:val="NormalTok"/>
+        </w:rPr>
+        <w:t>hospital_density</w:t>
+      </w:r>
+      <w:proofErr w:type="spellEnd"/>
+      <w:r>
+        <w:rPr>
+          <w:rStyle w:val="NormalTok"/>
+        </w:rPr>
+        <w:t xml:space="preserve"> </w:t>
+      </w:r>
+      <w:r>
+        <w:rPr>
+          <w:rStyle w:val="OtherTok"/>
+        </w:rPr>
+        <w:t>&lt;-</w:t>
+      </w:r>
+      <w:r>
+        <w:rPr>
+          <w:rStyle w:val="NormalTok"/>
+        </w:rPr>
+        <w:t xml:space="preserve"> </w:t>
+      </w:r>
+      <w:proofErr w:type="spellStart"/>
+      <w:r>
+        <w:rPr>
+          <w:rStyle w:val="NormalTok"/>
+        </w:rPr>
+        <w:t>hospital_density</w:t>
+      </w:r>
+      <w:proofErr w:type="spellEnd"/>
+      <w:r>
+        <w:rPr>
+          <w:rStyle w:val="NormalTok"/>
+        </w:rPr>
+        <w:t xml:space="preserve"> </w:t>
+      </w:r>
+      <w:r>
+        <w:rPr>
+          <w:rStyle w:val="SpecialCharTok"/>
+        </w:rPr>
+        <w:t>%&gt;%</w:t>
+      </w:r>
+      <w:r>
+        <w:br/>
+      </w:r>
+      <w:r>
+        <w:rPr>
+          <w:rStyle w:val="NormalTok"/>
+        </w:rPr>
+        <w:t xml:space="preserve">  </w:t>
+      </w:r>
+      <w:r>
+        <w:rPr>
+          <w:rStyle w:val="FunctionTok"/>
+        </w:rPr>
+        <w:t>mutate</w:t>
+      </w:r>
+      <w:r>
+        <w:rPr>
+          <w:rStyle w:val="NormalTok"/>
+        </w:rPr>
+        <w:t>(</w:t>
+      </w:r>
+      <w:r>
+        <w:rPr>
+          <w:rStyle w:val="AttributeTok"/>
+        </w:rPr>
+        <w:t>COUNTYFIPS =</w:t>
+      </w:r>
+      <w:r>
+        <w:rPr>
+          <w:rStyle w:val="NormalTok"/>
+        </w:rPr>
+        <w:t xml:space="preserve"> </w:t>
+      </w:r>
+      <w:proofErr w:type="spellStart"/>
+      <w:r>
+        <w:rPr>
+          <w:rStyle w:val="FunctionTok"/>
+        </w:rPr>
+        <w:t>as.character</w:t>
+      </w:r>
+      <w:proofErr w:type="spellEnd"/>
+      <w:r>
+        <w:rPr>
+          <w:rStyle w:val="NormalTok"/>
+        </w:rPr>
+        <w:t>(COUNTYFIPS))</w:t>
       </w:r>
     </w:p>
     <w:p>
       <w:pPr>
-        <w:pStyle w:val="SourceCode"/>
-      </w:pPr>
-      <w:r>
-        <w:rPr>
-          <w:rStyle w:val="NormalTok"/>
-        </w:rPr>
-        <w:t xml:space="preserve">combined_data </w:t>
-      </w:r>
-      <w:r>
-        <w:rPr>
-          <w:rStyle w:val="OtherTok"/>
-        </w:rPr>
-        <w:t>&lt;-</w:t>
-      </w:r>
-      <w:r>
-        <w:rPr>
-          <w:rStyle w:val="NormalTok"/>
-        </w:rPr>
-        <w:t xml:space="preserve"> covid_data </w:t>
-      </w:r>
-      <w:r>
-        <w:rPr>
-          <w:rStyle w:val="SpecialCharTok"/>
-        </w:rPr>
-        <w:t>%&gt;%</w:t>
-      </w:r>
-      <w:r>
-        <w:br/>
-      </w:r>
-      <w:r>
-        <w:rPr>
-          <w:rStyle w:val="NormalTok"/>
-        </w:rPr>
-        <w:t xml:space="preserve">  </w:t>
-      </w:r>
-      <w:r>
-        <w:rPr>
-          <w:rStyle w:val="FunctionTok"/>
-        </w:rPr>
-        <w:t>inner_join</w:t>
-      </w:r>
-      <w:r>
-        <w:rPr>
-          <w:rStyle w:val="NormalTok"/>
-        </w:rPr>
-        <w:t xml:space="preserve">(hospital_density, </w:t>
-      </w:r>
-      <w:r>
-        <w:rPr>
-          <w:rStyle w:val="AttributeTok"/>
-        </w:rPr>
-        <w:t>by =</w:t>
-      </w:r>
-      <w:r>
-        <w:rPr>
-          <w:rStyle w:val="NormalTok"/>
-        </w:rPr>
-        <w:t xml:space="preserve"> </w:t>
-      </w:r>
-      <w:r>
-        <w:rPr>
-          <w:rStyle w:val="StringTok"/>
-        </w:rPr>
-        <w:t>"COUNTYFIPS"</w:t>
-      </w:r>
-      <w:r>
-        <w:rPr>
-          <w:rStyle w:val="NormalTok"/>
-        </w:rPr>
-        <w:t>)</w:t>
+        <w:pStyle w:val="FirstParagraph"/>
+      </w:pPr>
+      <w:r>
+        <w:t>Visualize the data</w:t>
       </w:r>
     </w:p>
     <w:p>
       <w:pPr>
-        <w:pStyle w:val="FirstParagraph"/>
-      </w:pPr>
-      <w:r>
-        <w:t>Visualize the data</w:t>
+        <w:pStyle w:val="SourceCode"/>
+      </w:pPr>
+      <w:r>
+        <w:rPr>
+          <w:rStyle w:val="FunctionTok"/>
+        </w:rPr>
+        <w:t>ggplot</w:t>
+      </w:r>
+      <w:r>
+        <w:rPr>
+          <w:rStyle w:val="NormalTok"/>
+        </w:rPr>
+        <w:t xml:space="preserve">(combined_data, </w:t>
+      </w:r>
+      <w:r>
+        <w:rPr>
+          <w:rStyle w:val="FunctionTok"/>
+        </w:rPr>
+        <w:t>aes</w:t>
+      </w:r>
+      <w:r>
+        <w:rPr>
+          <w:rStyle w:val="NormalTok"/>
+        </w:rPr>
+        <w:t>(</w:t>
+      </w:r>
+      <w:r>
+        <w:rPr>
+          <w:rStyle w:val="AttributeTok"/>
+        </w:rPr>
+        <w:t>x =</w:t>
+      </w:r>
+      <w:r>
+        <w:rPr>
+          <w:rStyle w:val="NormalTok"/>
+        </w:rPr>
+        <w:t xml:space="preserve"> hospital_count, </w:t>
+      </w:r>
+      <w:r>
+        <w:rPr>
+          <w:rStyle w:val="AttributeTok"/>
+        </w:rPr>
+        <w:t>y =</w:t>
+      </w:r>
+      <w:r>
+        <w:rPr>
+          <w:rStyle w:val="NormalTok"/>
+        </w:rPr>
+        <w:t xml:space="preserve"> total_cases)) </w:t>
+      </w:r>
+      <w:r>
+        <w:rPr>
+          <w:rStyle w:val="SpecialCharTok"/>
+        </w:rPr>
+        <w:t>+</w:t>
+      </w:r>
+      <w:r>
+        <w:br/>
+      </w:r>
+      <w:r>
+        <w:rPr>
+          <w:rStyle w:val="NormalTok"/>
+        </w:rPr>
+        <w:t xml:space="preserve">  </w:t>
+      </w:r>
+      <w:r>
+        <w:rPr>
+          <w:rStyle w:val="FunctionTok"/>
+        </w:rPr>
+        <w:t>geom_point</w:t>
+      </w:r>
+      <w:r>
+        <w:rPr>
+          <w:rStyle w:val="NormalTok"/>
+        </w:rPr>
+        <w:t xml:space="preserve">() </w:t>
+      </w:r>
+      <w:r>
+        <w:rPr>
+          <w:rStyle w:val="SpecialCharTok"/>
+        </w:rPr>
+        <w:t>+</w:t>
+      </w:r>
+      <w:r>
+        <w:br/>
+      </w:r>
+      <w:r>
+        <w:rPr>
+          <w:rStyle w:val="NormalTok"/>
+        </w:rPr>
+        <w:t xml:space="preserve">  </w:t>
+      </w:r>
+      <w:r>
+        <w:rPr>
+          <w:rStyle w:val="FunctionTok"/>
+        </w:rPr>
+        <w:t>geom_smooth</w:t>
+      </w:r>
+      <w:r>
+        <w:rPr>
+          <w:rStyle w:val="NormalTok"/>
+        </w:rPr>
+        <w:t>(</w:t>
+      </w:r>
+      <w:r>
+        <w:rPr>
+          <w:rStyle w:val="AttributeTok"/>
+        </w:rPr>
+        <w:t>method =</w:t>
+      </w:r>
+      <w:r>
+        <w:rPr>
+          <w:rStyle w:val="NormalTok"/>
+        </w:rPr>
+        <w:t xml:space="preserve"> </w:t>
+      </w:r>
+      <w:r>
+        <w:rPr>
+          <w:rStyle w:val="StringTok"/>
+        </w:rPr>
+        <w:t>"lm"</w:t>
+      </w:r>
+      <w:r>
+        <w:rPr>
+          <w:rStyle w:val="NormalTok"/>
+        </w:rPr>
+        <w:t xml:space="preserve">, </w:t>
+      </w:r>
+      <w:r>
+        <w:rPr>
+          <w:rStyle w:val="AttributeTok"/>
+        </w:rPr>
+        <w:t>se =</w:t>
+      </w:r>
+      <w:r>
+        <w:rPr>
+          <w:rStyle w:val="NormalTok"/>
+        </w:rPr>
+        <w:t xml:space="preserve"> </w:t>
+      </w:r>
+      <w:r>
+        <w:rPr>
+          <w:rStyle w:val="ConstantTok"/>
+        </w:rPr>
+        <w:t>TRUE</w:t>
+      </w:r>
+      <w:r>
+        <w:rPr>
+          <w:rStyle w:val="NormalTok"/>
+        </w:rPr>
+        <w:t xml:space="preserve">) </w:t>
+      </w:r>
+      <w:r>
+        <w:rPr>
+          <w:rStyle w:val="SpecialCharTok"/>
+        </w:rPr>
+        <w:t>+</w:t>
+      </w:r>
+      <w:r>
+        <w:br/>
+      </w:r>
+      <w:r>
+        <w:rPr>
+          <w:rStyle w:val="NormalTok"/>
+        </w:rPr>
+        <w:t xml:space="preserve">  </w:t>
+      </w:r>
+      <w:r>
+        <w:rPr>
+          <w:rStyle w:val="FunctionTok"/>
+        </w:rPr>
+        <w:t>labs</w:t>
+      </w:r>
+      <w:r>
+        <w:rPr>
+          <w:rStyle w:val="NormalTok"/>
+        </w:rPr>
+        <w:t>(</w:t>
+      </w:r>
+      <w:r>
+        <w:rPr>
+          <w:rStyle w:val="AttributeTok"/>
+        </w:rPr>
+        <w:t>title =</w:t>
+      </w:r>
+      <w:r>
+        <w:rPr>
+          <w:rStyle w:val="NormalTok"/>
+        </w:rPr>
+        <w:t xml:space="preserve"> </w:t>
+      </w:r>
+      <w:r>
+        <w:rPr>
+          <w:rStyle w:val="StringTok"/>
+        </w:rPr>
+        <w:t>"COVID-19 Cases vs Hospital Density"</w:t>
+      </w:r>
+      <w:r>
+        <w:rPr>
+          <w:rStyle w:val="NormalTok"/>
+        </w:rPr>
+        <w:t>,</w:t>
+      </w:r>
+      <w:r>
+        <w:br/>
+      </w:r>
+      <w:r>
+        <w:rPr>
+          <w:rStyle w:val="NormalTok"/>
+        </w:rPr>
+        <w:t xml:space="preserve">       </w:t>
+      </w:r>
+      <w:r>
+        <w:rPr>
+          <w:rStyle w:val="AttributeTok"/>
+        </w:rPr>
+        <w:t>x =</w:t>
+      </w:r>
+      <w:r>
+        <w:rPr>
+          <w:rStyle w:val="NormalTok"/>
+        </w:rPr>
+        <w:t xml:space="preserve"> </w:t>
+      </w:r>
+      <w:r>
+        <w:rPr>
+          <w:rStyle w:val="StringTok"/>
+        </w:rPr>
+        <w:t>"Hospitals per County"</w:t>
+      </w:r>
+      <w:r>
+        <w:rPr>
+          <w:rStyle w:val="NormalTok"/>
+        </w:rPr>
+        <w:t>,</w:t>
+      </w:r>
+      <w:r>
+        <w:br/>
+      </w:r>
+      <w:r>
+        <w:rPr>
+          <w:rStyle w:val="NormalTok"/>
+        </w:rPr>
+        <w:t xml:space="preserve">       </w:t>
+      </w:r>
+      <w:r>
+        <w:rPr>
+          <w:rStyle w:val="AttributeTok"/>
+        </w:rPr>
+        <w:t>y =</w:t>
+      </w:r>
+      <w:r>
+        <w:rPr>
+          <w:rStyle w:val="NormalTok"/>
+        </w:rPr>
+        <w:t xml:space="preserve"> </w:t>
+      </w:r>
+      <w:r>
+        <w:rPr>
+          <w:rStyle w:val="StringTok"/>
+        </w:rPr>
+        <w:t>"Total COVID-19 Cases"</w:t>
+      </w:r>
+      <w:r>
+        <w:rPr>
+          <w:rStyle w:val="NormalTok"/>
+        </w:rPr>
+        <w:t>)</w:t>
       </w:r>
     </w:p>
     <w:p>
@@ -572,286 +1128,13 @@
       </w:pPr>
       <w:r>
         <w:rPr>
-          <w:rStyle w:val="FunctionTok"/>
-        </w:rPr>
-        <w:lastRenderedPageBreak/>
-        <w:t>ggplot</w:t>
-      </w:r>
-      <w:r>
-        <w:rPr>
-          <w:rStyle w:val="NormalTok"/>
-        </w:rPr>
-        <w:t xml:space="preserve">(combined_data, </w:t>
-      </w:r>
-      <w:r>
-        <w:rPr>
-          <w:rStyle w:val="FunctionTok"/>
-        </w:rPr>
-        <w:t>aes</w:t>
-      </w:r>
-      <w:r>
-        <w:rPr>
-          <w:rStyle w:val="NormalTok"/>
-        </w:rPr>
-        <w:t>(</w:t>
-      </w:r>
-      <w:r>
-        <w:rPr>
-          <w:rStyle w:val="AttributeTok"/>
-        </w:rPr>
-        <w:t>x =</w:t>
-      </w:r>
-      <w:r>
-        <w:rPr>
-          <w:rStyle w:val="NormalTok"/>
-        </w:rPr>
-        <w:t xml:space="preserve"> hospital_count, </w:t>
-      </w:r>
-      <w:r>
-        <w:rPr>
-          <w:rStyle w:val="AttributeTok"/>
-        </w:rPr>
-        <w:t>y =</w:t>
-      </w:r>
-      <w:r>
-        <w:rPr>
-          <w:rStyle w:val="NormalTok"/>
-        </w:rPr>
-        <w:t xml:space="preserve"> total_cases)) </w:t>
-      </w:r>
-      <w:r>
-        <w:rPr>
-          <w:rStyle w:val="SpecialCharTok"/>
-        </w:rPr>
-        <w:t>+</w:t>
-      </w:r>
-      <w:r>
-        <w:br/>
-      </w:r>
-      <w:r>
-        <w:rPr>
-          <w:rStyle w:val="NormalTok"/>
-        </w:rPr>
-        <w:t xml:space="preserve">  </w:t>
-      </w:r>
-      <w:r>
-        <w:rPr>
-          <w:rStyle w:val="FunctionTok"/>
-        </w:rPr>
-        <w:t>geom_point</w:t>
-      </w:r>
-      <w:r>
-        <w:rPr>
-          <w:rStyle w:val="NormalTok"/>
-        </w:rPr>
-        <w:t xml:space="preserve">() </w:t>
-      </w:r>
-      <w:r>
-        <w:rPr>
-          <w:rStyle w:val="SpecialCharTok"/>
-        </w:rPr>
-        <w:t>+</w:t>
-      </w:r>
-      <w:r>
-        <w:br/>
-      </w:r>
-      <w:r>
-        <w:rPr>
-          <w:rStyle w:val="NormalTok"/>
-        </w:rPr>
-        <w:t xml:space="preserve">  </w:t>
-      </w:r>
-      <w:r>
-        <w:rPr>
-          <w:rStyle w:val="FunctionTok"/>
-        </w:rPr>
-        <w:t>geom_smooth</w:t>
-      </w:r>
-      <w:r>
-        <w:rPr>
-          <w:rStyle w:val="NormalTok"/>
-        </w:rPr>
-        <w:t>(</w:t>
-      </w:r>
-      <w:r>
-        <w:rPr>
-          <w:rStyle w:val="AttributeTok"/>
-        </w:rPr>
-        <w:t>method =</w:t>
-      </w:r>
-      <w:r>
-        <w:rPr>
-          <w:rStyle w:val="NormalTok"/>
-        </w:rPr>
-        <w:t xml:space="preserve"> </w:t>
-      </w:r>
-      <w:r>
-        <w:rPr>
-          <w:rStyle w:val="StringTok"/>
-        </w:rPr>
-        <w:t>"lm"</w:t>
-      </w:r>
-      <w:r>
-        <w:rPr>
-          <w:rStyle w:val="NormalTok"/>
-        </w:rPr>
-        <w:t xml:space="preserve">, </w:t>
-      </w:r>
-      <w:r>
-        <w:rPr>
-          <w:rStyle w:val="AttributeTok"/>
-        </w:rPr>
-        <w:t>se =</w:t>
-      </w:r>
-      <w:r>
-        <w:rPr>
-          <w:rStyle w:val="NormalTok"/>
-        </w:rPr>
-        <w:t xml:space="preserve"> </w:t>
-      </w:r>
-      <w:r>
-        <w:rPr>
-          <w:rStyle w:val="ConstantTok"/>
-        </w:rPr>
-        <w:t>TRUE</w:t>
-      </w:r>
-      <w:r>
-        <w:rPr>
-          <w:rStyle w:val="NormalTok"/>
-        </w:rPr>
-        <w:t xml:space="preserve">) </w:t>
-      </w:r>
-      <w:r>
-        <w:rPr>
-          <w:rStyle w:val="SpecialCharTok"/>
-        </w:rPr>
-        <w:t>+</w:t>
-      </w:r>
-      <w:r>
-        <w:br/>
-      </w:r>
-      <w:r>
-        <w:rPr>
-          <w:rStyle w:val="NormalTok"/>
-        </w:rPr>
-        <w:t xml:space="preserve">  </w:t>
-      </w:r>
-      <w:r>
-        <w:rPr>
-          <w:rStyle w:val="FunctionTok"/>
-        </w:rPr>
-        <w:t>labs</w:t>
-      </w:r>
-      <w:r>
-        <w:rPr>
-          <w:rStyle w:val="NormalTok"/>
-        </w:rPr>
-        <w:t>(</w:t>
-      </w:r>
-      <w:r>
-        <w:rPr>
-          <w:rStyle w:val="AttributeTok"/>
-        </w:rPr>
-        <w:t>title =</w:t>
-      </w:r>
-      <w:r>
-        <w:rPr>
-          <w:rStyle w:val="NormalTok"/>
-        </w:rPr>
-        <w:t xml:space="preserve"> </w:t>
-      </w:r>
-      <w:r>
-        <w:rPr>
-          <w:rStyle w:val="StringTok"/>
-        </w:rPr>
-        <w:t>"COVID-19 Cases vs Hospital Density"</w:t>
-      </w:r>
-      <w:r>
-        <w:rPr>
-          <w:rStyle w:val="NormalTok"/>
-        </w:rPr>
-        <w:t>,</w:t>
-      </w:r>
-      <w:r>
-        <w:br/>
-      </w:r>
-      <w:r>
-        <w:rPr>
-          <w:rStyle w:val="NormalTok"/>
-        </w:rPr>
-        <w:t xml:space="preserve">       </w:t>
-      </w:r>
-      <w:r>
-        <w:rPr>
-          <w:rStyle w:val="AttributeTok"/>
-        </w:rPr>
-        <w:t>x =</w:t>
-      </w:r>
-      <w:r>
-        <w:rPr>
-          <w:rStyle w:val="NormalTok"/>
-        </w:rPr>
-        <w:t xml:space="preserve"> </w:t>
-      </w:r>
-      <w:r>
-        <w:rPr>
-          <w:rStyle w:val="StringTok"/>
-        </w:rPr>
-        <w:t>"Hospitals per County"</w:t>
-      </w:r>
-      <w:r>
-        <w:rPr>
-          <w:rStyle w:val="NormalTok"/>
-        </w:rPr>
-        <w:t>,</w:t>
-      </w:r>
-      <w:r>
-        <w:br/>
-      </w:r>
-      <w:r>
-        <w:rPr>
-          <w:rStyle w:val="NormalTok"/>
-        </w:rPr>
-        <w:t xml:space="preserve">       </w:t>
-      </w:r>
-      <w:r>
-        <w:rPr>
-          <w:rStyle w:val="AttributeTok"/>
-        </w:rPr>
-        <w:t>y =</w:t>
-      </w:r>
-      <w:r>
-        <w:rPr>
-          <w:rStyle w:val="NormalTok"/>
-        </w:rPr>
-        <w:t xml:space="preserve"> </w:t>
-      </w:r>
-      <w:r>
-        <w:rPr>
-          <w:rStyle w:val="StringTok"/>
-        </w:rPr>
-        <w:t>"Total COVID-19 Cases"</w:t>
-      </w:r>
-      <w:r>
-        <w:rPr>
-          <w:rStyle w:val="NormalTok"/>
-        </w:rPr>
-        <w:t>)</w:t>
+          <w:rStyle w:val="VerbatimChar"/>
+        </w:rPr>
+        <w:t>## `geom_smooth()` using formula = 'y ~ x'</w:t>
       </w:r>
     </w:p>
     <w:p>
       <w:pPr>
-        <w:pStyle w:val="SourceCode"/>
-      </w:pPr>
-      <w:r>
-        <w:rPr>
-          <w:rStyle w:val="VerbatimChar"/>
-        </w:rPr>
-        <w:t>## `geom_smooth()` using formula = 'y ~ x'</w:t>
-      </w:r>
-    </w:p>
-    <w:p>
-      <w:pPr>
         <w:pStyle w:val="FirstParagraph"/>
       </w:pPr>
       <w:r>
@@ -859,7 +1142,7 @@
           <w:noProof/>
         </w:rPr>
         <w:drawing>
-          <wp:inline distT="0" distB="0" distL="0" distR="0" wp14:anchorId="7B5878AF" wp14:editId="0C1AC9FD">
+          <wp:inline distT="0" distB="0" distL="0" distR="0" wp14:anchorId="159749A4" wp14:editId="67F0DEB5">
             <wp:extent cx="4620126" cy="3696101"/>
             <wp:effectExtent l="0" t="0" r="0" b="0"/>
             <wp:docPr id="21" name="Picture"/>
@@ -991,6 +1274,7 @@
         <w:rPr>
           <w:rStyle w:val="VerbatimChar"/>
         </w:rPr>
+        <w:lastRenderedPageBreak/>
         <w:t xml:space="preserve">## </w:t>
       </w:r>
       <w:r>
@@ -1036,16 +1320,16 @@
         <w:rPr>
           <w:rStyle w:val="VerbatimChar"/>
         </w:rPr>
-        <w:t xml:space="preserve">##      Min       1Q   Median       3Q      Max </w:t>
-      </w:r>
-      <w:r>
-        <w:br/>
-      </w:r>
-      <w:r>
-        <w:rPr>
-          <w:rStyle w:val="VerbatimChar"/>
-        </w:rPr>
-        <w:t xml:space="preserve">## -5636992  -127006     9835    84079 19023744 </w:t>
+        <w:t xml:space="preserve">##    Min     1Q Median     3Q    Max </w:t>
+      </w:r>
+      <w:r>
+        <w:br/>
+      </w:r>
+      <w:r>
+        <w:rPr>
+          <w:rStyle w:val="VerbatimChar"/>
+        </w:rPr>
+        <w:t xml:space="preserve">## -47729  -1047    -94    913 166560 </w:t>
       </w:r>
       <w:r>
         <w:br/>
@@ -1081,16 +1365,16 @@
         <w:rPr>
           <w:rStyle w:val="VerbatimChar"/>
         </w:rPr>
-        <w:t>## (Intercept)     -179747      18289  -9.828   &lt;2e-16 ***</w:t>
-      </w:r>
-      <w:r>
-        <w:br/>
-      </w:r>
-      <w:r>
-        <w:rPr>
-          <w:rStyle w:val="VerbatimChar"/>
-        </w:rPr>
-        <w:t>## hospital_count   199001       2938  67.728   &lt;2e-16 ***</w:t>
+        <w:t>## (Intercept)     -1392.9      171.2  -8.139 6.46e-16 ***</w:t>
+      </w:r>
+      <w:r>
+        <w:br/>
+      </w:r>
+      <w:r>
+        <w:rPr>
+          <w:rStyle w:val="VerbatimChar"/>
+        </w:rPr>
+        <w:t>## hospital_count   2113.8       27.5  76.872  &lt; 2e-16 ***</w:t>
       </w:r>
       <w:r>
         <w:br/>
@@ -1108,7 +1392,6 @@
         <w:rPr>
           <w:rStyle w:val="VerbatimChar"/>
         </w:rPr>
-        <w:lastRenderedPageBreak/>
         <w:t>## Signif. codes:  0 '***' 0.001 '**' 0.01 '*' 0.05 '.' 0.1 ' ' 1</w:t>
       </w:r>
       <w:r>
@@ -1127,25 +1410,25 @@
         <w:rPr>
           <w:rStyle w:val="VerbatimChar"/>
         </w:rPr>
-        <w:t>## Residual standard error: 774100 on 2318 degrees of freedom</w:t>
-      </w:r>
-      <w:r>
-        <w:br/>
-      </w:r>
-      <w:r>
-        <w:rPr>
-          <w:rStyle w:val="VerbatimChar"/>
-        </w:rPr>
-        <w:t xml:space="preserve">## Multiple R-squared:  0.6643, Adjusted R-squared:  0.6642 </w:t>
-      </w:r>
-      <w:r>
-        <w:br/>
-      </w:r>
-      <w:r>
-        <w:rPr>
-          <w:rStyle w:val="VerbatimChar"/>
-        </w:rPr>
-        <w:t>## F-statistic:  4587 on 1 and 2318 DF,  p-value: &lt; 2.2e-16</w:t>
+        <w:t>## Residual standard error: 7244 on 2318 degrees of freedom</w:t>
+      </w:r>
+      <w:r>
+        <w:br/>
+      </w:r>
+      <w:r>
+        <w:rPr>
+          <w:rStyle w:val="VerbatimChar"/>
+        </w:rPr>
+        <w:t xml:space="preserve">## Multiple R-squared:  0.7183, Adjusted R-squared:  0.7181 </w:t>
+      </w:r>
+      <w:r>
+        <w:br/>
+      </w:r>
+      <w:r>
+        <w:rPr>
+          <w:rStyle w:val="VerbatimChar"/>
+        </w:rPr>
+        <w:t>## F-statistic:  5909 on 1 and 2318 DF,  p-value: &lt; 2.2e-16</w:t>
       </w:r>
     </w:p>
     <w:p>
@@ -1182,16 +1465,16 @@
         <w:rPr>
           <w:rStyle w:val="VerbatimChar"/>
         </w:rPr>
-        <w:t>## (Intercept)    -215610.3 -143882.7</w:t>
-      </w:r>
-      <w:r>
-        <w:br/>
-      </w:r>
-      <w:r>
-        <w:rPr>
-          <w:rStyle w:val="VerbatimChar"/>
-        </w:rPr>
-        <w:t>## hospital_count  193238.7  204762.4</w:t>
+        <w:t>## (Intercept)    -1728.561 -1057.303</w:t>
+      </w:r>
+      <w:r>
+        <w:br/>
+      </w:r>
+      <w:r>
+        <w:rPr>
+          <w:rStyle w:val="VerbatimChar"/>
+        </w:rPr>
+        <w:t>## hospital_count  2059.846  2167.690</w:t>
       </w:r>
     </w:p>
     <w:p>
@@ -1216,7 +1499,7 @@
   <w:abstractNum w:abstractNumId="0" w15:restartNumberingAfterBreak="0">
     <w:nsid w:val="0000A990"/>
     <w:multiLevelType w:val="multilevel"/>
-    <w:tmpl w:val="43BE2DDE"/>
+    <w:tmpl w:val="0DEA3A7A"/>
     <w:lvl w:ilvl="0">
       <w:numFmt w:val="bullet"/>
       <w:lvlText w:val=" "/>
@@ -1290,7 +1573,7 @@
       </w:pPr>
     </w:lvl>
   </w:abstractNum>
-  <w:num w:numId="1" w16cid:durableId="751203433">
+  <w:num w:numId="1" w16cid:durableId="437985887">
     <w:abstractNumId w:val="0"/>
   </w:num>
 </w:numbering>

</xml_diff>